<commit_message>
Add experiment archives and update agreement
</commit_message>
<xml_diff>
--- a/License Agreement_CCSEMO_SIAT.docx
+++ b/License Agreement_CCSEMO_SIAT.docx
@@ -4869,11 +4869,16 @@
         </w:rPr>
       </w:pPr>
       <w:r>
-        <w:rPr>
-          <w:rFonts w:hint="eastAsia"/>
-          <w:spacing w:val="3"/>
-        </w:rPr>
-        <w:t xml:space="preserve">Guo Z, Liu Y, Yang Y, Yu H, Su R, Yan N, Wang L. CCSEMO: A Chinese Counseling Speech Emotion Dataset annotated via a unified standardized annotation framework. Pattern Recognition. https://doi.org/10.1016/j.patcog.2026.114277.</w:t>
+        <w:t xml:space="preserve">Guo, Z., Liu, Y., Yang, Y., Yu, H., Su, R., Yan, N., &amp; Wang, L. (2026). CCSEMO: A Chinese Counseling Speech Emotion Dataset annotated via a unified standardized annotation framework. </w:t>
+      </w:r>
+      <w:r>
+        <w:rPr>
+          <w:i/>
+        </w:rPr>
+        <w:t xml:space="preserve">Pattern Recognition</w:t>
+      </w:r>
+      <w:r>
+        <w:t xml:space="preserve">, 114277. https://doi.org/10.1016/j.patcog.2026.114277.</w:t>
       </w:r>
     </w:p>
     <w:p>

</xml_diff>